<commit_message>
All 57 templates in English and Spanish: final build, Español download on every card
Co-Authored-By: Claude Opus 5.5 <noreply@anthropic.com>
Claude-Session: https://claude.ai/code/session_012WEC1qutQtsV9VUQGDVAHW
</commit_message>
<xml_diff>
--- a/assets/legal-templates/es/board-interest-declaration.docx
+++ b/assets/legal-templates/es/board-interest-declaration.docx
@@ -19,7 +19,7 @@
             <wp:extent cx="7562850" cy="10696575"/>
             <wp:effectExtent t="0" r="0" b="0" l="0"/>
             <wp:wrapNone/>
-            <wp:docPr id="1" name="" descr="" title=""/>
+            <wp:docPr id="3" name="" descr="" title=""/>
             <wp:cNvGraphicFramePr>
               <a:graphicFrameLocks xmlns:a="http://schemas.openxmlformats.org/drawingml/2006/main" noChangeAspect="1"/>
             </wp:cNvGraphicFramePr>
@@ -7414,7 +7414,7 @@
         <wp:inline distT="0" distB="0" distL="0" distR="0">
           <wp:extent cx="1333500" cy="204788"/>
           <wp:effectExtent t="0" r="0" b="0" l="0"/>
-          <wp:docPr id="2" name="" descr="" title=""/>
+          <wp:docPr id="4" name="" descr="" title=""/>
           <wp:cNvGraphicFramePr>
             <a:graphicFrameLocks xmlns:a="http://schemas.openxmlformats.org/drawingml/2006/main" noChangeAspect="1"/>
           </wp:cNvGraphicFramePr>

</xml_diff>